<commit_message>
change docMonth to reportMonth in word
</commit_message>
<xml_diff>
--- a/public/template.docx
+++ b/public/template.docx
@@ -57,21 +57,21 @@
         <w:spacing w:before="120" w:after="120"/>
         <w:jc w:val="thaiDistribute"/>
         <w:rPr>
-          <w:rFonts w:ascii="TH SarabunIT๙" w:hAnsi="TH SarabunIT๙" w:cs="TH SarabunIT๙"/>
-          <w:sz w:val="32"/>
-          <w:szCs w:val="32"/>
-          <w:cs/>
-          <w:lang w:eastAsia="en-US"/>
-        </w:rPr>
-      </w:pPr>
-      <w:r>
-        <w:rPr>
           <w:rFonts w:ascii="TH SarabunIT๙" w:hAnsi="TH SarabunIT๙" w:cs="TH SarabunIT๙" w:hint="cs"/>
           <w:sz w:val="32"/>
           <w:szCs w:val="32"/>
           <w:cs/>
           <w:lang w:eastAsia="en-US"/>
         </w:rPr>
+      </w:pPr>
+      <w:r>
+        <w:rPr>
+          <w:rFonts w:ascii="TH SarabunIT๙" w:hAnsi="TH SarabunIT๙" w:cs="TH SarabunIT๙" w:hint="cs"/>
+          <w:sz w:val="32"/>
+          <w:szCs w:val="32"/>
+          <w:cs/>
+          <w:lang w:eastAsia="en-US"/>
+        </w:rPr>
         <w:tab/>
       </w:r>
       <w:r>
@@ -126,7 +126,6 @@
       <w:r>
         <w:rPr>
           <w:rFonts w:ascii="TH SarabunIT๙" w:hAnsi="TH SarabunIT๙" w:cs="TH SarabunIT๙"/>
-          <w:color w:val="FF0000"/>
           <w:sz w:val="32"/>
           <w:szCs w:val="32"/>
           <w:lang w:eastAsia="en-US"/>
@@ -137,7 +136,6 @@
       <w:r>
         <w:rPr>
           <w:rFonts w:ascii="TH SarabunIT๙" w:hAnsi="TH SarabunIT๙" w:cs="TH SarabunIT๙"/>
-          <w:color w:val="FF0000"/>
           <w:sz w:val="32"/>
           <w:szCs w:val="32"/>
           <w:lang w:eastAsia="en-US"/>
@@ -148,15 +146,12 @@
       <w:r>
         <w:rPr>
           <w:rFonts w:ascii="TH SarabunIT๙" w:hAnsi="TH SarabunIT๙" w:cs="TH SarabunIT๙"/>
-          <w:color w:val="FF0000"/>
           <w:sz w:val="32"/>
           <w:szCs w:val="32"/>
           <w:lang w:eastAsia="en-US"/>
         </w:rPr>
         <w:t>}</w:t>
       </w:r>
-      <w:bookmarkStart w:id="0" w:name="_GoBack"/>
-      <w:bookmarkEnd w:id="0"/>
     </w:p>
     <w:p>
       <w:pPr>
@@ -1232,7 +1227,16 @@
                 <w:sz w:val="32"/>
                 <w:szCs w:val="32"/>
               </w:rPr>
-              <w:t>} {</w:t>
+              <w:t xml:space="preserve">} </w:t>
+            </w:r>
+            <w:r>
+              <w:rPr>
+                <w:rFonts w:ascii="TH SarabunIT๙" w:hAnsi="TH SarabunIT๙" w:cs="TH SarabunIT๙"/>
+                <w:sz w:val="32"/>
+                <w:szCs w:val="32"/>
+                <w:lang w:eastAsia="en-US"/>
+              </w:rPr>
+              <w:t>{</w:t>
             </w:r>
             <w:proofErr w:type="spellStart"/>
             <w:r>
@@ -1240,8 +1244,9 @@
                 <w:rFonts w:ascii="TH SarabunIT๙" w:hAnsi="TH SarabunIT๙" w:cs="TH SarabunIT๙"/>
                 <w:sz w:val="32"/>
                 <w:szCs w:val="32"/>
+                <w:lang w:eastAsia="en-US"/>
               </w:rPr>
-              <w:t>docMonth</w:t>
+              <w:t>reportMonth</w:t>
             </w:r>
             <w:proofErr w:type="spellEnd"/>
             <w:r>
@@ -1249,24 +1254,7 @@
                 <w:rFonts w:ascii="TH SarabunIT๙" w:hAnsi="TH SarabunIT๙" w:cs="TH SarabunIT๙"/>
                 <w:sz w:val="32"/>
                 <w:szCs w:val="32"/>
-              </w:rPr>
-              <w:t>} {</w:t>
-            </w:r>
-            <w:proofErr w:type="spellStart"/>
-            <w:r>
-              <w:rPr>
-                <w:rFonts w:ascii="TH SarabunIT๙" w:hAnsi="TH SarabunIT๙" w:cs="TH SarabunIT๙"/>
-                <w:sz w:val="32"/>
-                <w:szCs w:val="32"/>
-              </w:rPr>
-              <w:t>docYear</w:t>
-            </w:r>
-            <w:proofErr w:type="spellEnd"/>
-            <w:r>
-              <w:rPr>
-                <w:rFonts w:ascii="TH SarabunIT๙" w:hAnsi="TH SarabunIT๙" w:cs="TH SarabunIT๙"/>
-                <w:sz w:val="32"/>
-                <w:szCs w:val="32"/>
+                <w:lang w:eastAsia="en-US"/>
               </w:rPr>
               <w:t>}</w:t>
             </w:r>
@@ -1300,7 +1288,17 @@
                 <w:sz w:val="32"/>
                 <w:szCs w:val="32"/>
               </w:rPr>
-              <w:t>{description}</w:t>
+              <w:t>{descr</w:t>
+            </w:r>
+            <w:bookmarkStart w:id="0" w:name="_GoBack"/>
+            <w:bookmarkEnd w:id="0"/>
+            <w:r>
+              <w:rPr>
+                <w:rFonts w:ascii="TH SarabunIT๙" w:hAnsi="TH SarabunIT๙" w:cs="TH SarabunIT๙"/>
+                <w:sz w:val="32"/>
+                <w:szCs w:val="32"/>
+              </w:rPr>
+              <w:t>iption}</w:t>
             </w:r>
           </w:p>
         </w:tc>
@@ -1345,7 +1343,7 @@
       <w:pPr>
         <w:spacing w:before="120"/>
         <w:rPr>
-          <w:rFonts w:ascii="TH SarabunIT๙" w:hAnsi="TH SarabunIT๙" w:cs="TH SarabunIT๙" w:hint="cs"/>
+          <w:rFonts w:ascii="TH SarabunIT๙" w:hAnsi="TH SarabunIT๙" w:cs="TH SarabunIT๙"/>
           <w:b/>
           <w:bCs/>
           <w:sz w:val="32"/>
@@ -4905,7 +4903,7 @@
 </file>
 
 <file path=customXml/itemProps1.xml><?xml version="1.0" encoding="utf-8"?>
-<ds:datastoreItem xmlns:ds="http://schemas.openxmlformats.org/officeDocument/2006/customXml" ds:itemID="{D5098544-6BBC-4BEE-8690-3E2B87C6FF7E}">
+<ds:datastoreItem xmlns:ds="http://schemas.openxmlformats.org/officeDocument/2006/customXml" ds:itemID="{53D2168A-3596-430D-B545-80B180A14185}">
   <ds:schemaRefs>
     <ds:schemaRef ds:uri="http://schemas.openxmlformats.org/officeDocument/2006/bibliography"/>
   </ds:schemaRefs>

</xml_diff>